<commit_message>
Episode_5: How Machines Represent Meaning
</commit_message>
<xml_diff>
--- a/AI/Season_1/Episode_5/HowMachinesRepresentMeaning.docx
+++ b/AI/Season_1/Episode_5/HowMachinesRepresentMeaning.docx
@@ -630,6 +630,400 @@
           <w:lang w:val="en-US"/>
         </w:rPr>
         <w:t xml:space="preserve"> It is a numerical representation that captures useful patterns about that word.</w:t>
+      </w:r>
+    </w:p>
+    <w:p>
+      <w:pPr>
+        <w:rPr>
+          <w:sz w:val="24"/>
+          <w:szCs w:val="24"/>
+          <w:lang w:val="en-US"/>
+        </w:rPr>
+      </w:pPr>
+    </w:p>
+    <w:p>
+      <w:pPr>
+        <w:pStyle w:val="ListParagraph"/>
+        <w:numPr>
+          <w:ilvl w:val="0"/>
+          <w:numId w:val="1"/>
+        </w:numPr>
+        <w:rPr>
+          <w:sz w:val="24"/>
+          <w:szCs w:val="24"/>
+          <w:lang w:val="en-US"/>
+        </w:rPr>
+      </w:pPr>
+      <w:r>
+        <w:rPr>
+          <w:sz w:val="24"/>
+          <w:szCs w:val="24"/>
+          <w:lang w:val="en-US"/>
+        </w:rPr>
+        <w:t>More dimensions != more intelligence</w:t>
+      </w:r>
+      <w:r>
+        <w:rPr>
+          <w:sz w:val="24"/>
+          <w:szCs w:val="24"/>
+          <w:lang w:val="en-US"/>
+        </w:rPr>
+        <w:t>. A model-specific embedding may contain thousands and thousands of values.</w:t>
+      </w:r>
+    </w:p>
+    <w:p>
+      <w:pPr>
+        <w:pStyle w:val="ListParagraph"/>
+        <w:rPr>
+          <w:sz w:val="24"/>
+          <w:szCs w:val="24"/>
+          <w:lang w:val="en-US"/>
+        </w:rPr>
+      </w:pPr>
+      <w:r>
+        <w:rPr>
+          <w:sz w:val="24"/>
+          <w:szCs w:val="24"/>
+          <w:lang w:val="en-US"/>
+        </w:rPr>
+        <w:t>Higher dimensions can capture more complex patterns, but they also require more storage and computation.</w:t>
+      </w:r>
+    </w:p>
+    <w:p>
+      <w:pPr>
+        <w:rPr>
+          <w:sz w:val="24"/>
+          <w:szCs w:val="24"/>
+          <w:lang w:val="en-US"/>
+        </w:rPr>
+      </w:pPr>
+    </w:p>
+    <w:p>
+      <w:pPr>
+        <w:pStyle w:val="ListParagraph"/>
+        <w:numPr>
+          <w:ilvl w:val="0"/>
+          <w:numId w:val="1"/>
+        </w:numPr>
+        <w:rPr>
+          <w:sz w:val="24"/>
+          <w:szCs w:val="24"/>
+          <w:lang w:val="en-US"/>
+        </w:rPr>
+      </w:pPr>
+      <w:r>
+        <w:rPr>
+          <w:sz w:val="24"/>
+          <w:szCs w:val="24"/>
+          <w:lang w:val="en-US"/>
+        </w:rPr>
+        <w:t>As we add dimensions, the representation becomes richer.</w:t>
+      </w:r>
+    </w:p>
+    <w:p>
+      <w:pPr>
+        <w:pStyle w:val="ListParagraph"/>
+        <w:rPr>
+          <w:sz w:val="24"/>
+          <w:szCs w:val="24"/>
+          <w:lang w:val="en-US"/>
+        </w:rPr>
+      </w:pPr>
+      <w:r>
+        <w:rPr>
+          <w:sz w:val="24"/>
+          <w:szCs w:val="24"/>
+          <w:lang w:val="en-US"/>
+        </w:rPr>
+        <w:t>Language is far more complex, so embeddings require many dimensions to capture different patterns and relationships.</w:t>
+      </w:r>
+    </w:p>
+    <w:p>
+      <w:pPr>
+        <w:rPr>
+          <w:sz w:val="24"/>
+          <w:szCs w:val="24"/>
+          <w:lang w:val="en-US"/>
+        </w:rPr>
+      </w:pPr>
+    </w:p>
+    <w:p>
+      <w:pPr>
+        <w:pStyle w:val="ListParagraph"/>
+        <w:numPr>
+          <w:ilvl w:val="0"/>
+          <w:numId w:val="1"/>
+        </w:numPr>
+        <w:rPr>
+          <w:sz w:val="24"/>
+          <w:szCs w:val="24"/>
+          <w:lang w:val="en-US"/>
+        </w:rPr>
+      </w:pPr>
+      <w:r>
+        <w:rPr>
+          <w:sz w:val="24"/>
+          <w:szCs w:val="24"/>
+          <w:lang w:val="en-US"/>
+        </w:rPr>
+        <w:t>When embeddings are trained well, related concepts often form neighbourhoods.</w:t>
+      </w:r>
+      <w:r>
+        <w:rPr>
+          <w:sz w:val="24"/>
+          <w:szCs w:val="24"/>
+          <w:lang w:val="en-US"/>
+        </w:rPr>
+        <w:t xml:space="preserve"> But these neighborhoods are not manually programmed.</w:t>
+      </w:r>
+      <w:r>
+        <w:rPr>
+          <w:sz w:val="24"/>
+          <w:szCs w:val="24"/>
+          <w:lang w:val="en-US"/>
+        </w:rPr>
+        <w:t xml:space="preserve"> They emerge from usage patterns in data.</w:t>
+      </w:r>
+    </w:p>
+    <w:p>
+      <w:pPr>
+        <w:rPr>
+          <w:sz w:val="24"/>
+          <w:szCs w:val="24"/>
+          <w:lang w:val="en-US"/>
+        </w:rPr>
+      </w:pPr>
+    </w:p>
+    <w:p>
+      <w:pPr>
+        <w:pStyle w:val="ListParagraph"/>
+        <w:numPr>
+          <w:ilvl w:val="0"/>
+          <w:numId w:val="1"/>
+        </w:numPr>
+        <w:rPr>
+          <w:sz w:val="24"/>
+          <w:szCs w:val="24"/>
+          <w:lang w:val="en-US"/>
+        </w:rPr>
+      </w:pPr>
+      <w:r>
+        <w:rPr>
+          <w:sz w:val="24"/>
+          <w:szCs w:val="24"/>
+          <w:lang w:val="en-US"/>
+        </w:rPr>
+        <w:t>Through training, the numerical representations are adjusted so that useful relationships become encoded in the vector space.</w:t>
+      </w:r>
+    </w:p>
+    <w:p>
+      <w:pPr>
+        <w:rPr>
+          <w:sz w:val="24"/>
+          <w:szCs w:val="24"/>
+          <w:lang w:val="en-US"/>
+        </w:rPr>
+      </w:pPr>
+    </w:p>
+    <w:p>
+      <w:pPr>
+        <w:pStyle w:val="ListParagraph"/>
+        <w:numPr>
+          <w:ilvl w:val="0"/>
+          <w:numId w:val="1"/>
+        </w:numPr>
+        <w:rPr>
+          <w:sz w:val="24"/>
+          <w:szCs w:val="24"/>
+          <w:lang w:val="en-US"/>
+        </w:rPr>
+      </w:pPr>
+      <w:r>
+        <w:rPr>
+          <w:sz w:val="24"/>
+          <w:szCs w:val="24"/>
+          <w:lang w:val="en-US"/>
+        </w:rPr>
+        <w:t>Semantic similarity measures how close 2 pieces of text are in meaning.</w:t>
+      </w:r>
+    </w:p>
+    <w:p>
+      <w:pPr>
+        <w:pStyle w:val="ListParagraph"/>
+        <w:rPr>
+          <w:sz w:val="24"/>
+          <w:szCs w:val="24"/>
+          <w:lang w:val="en-US"/>
+        </w:rPr>
+      </w:pPr>
+    </w:p>
+    <w:p>
+      <w:pPr>
+        <w:pStyle w:val="ListParagraph"/>
+        <w:rPr>
+          <w:sz w:val="24"/>
+          <w:szCs w:val="24"/>
+          <w:lang w:val="en-US"/>
+        </w:rPr>
+      </w:pPr>
+      <w:r>
+        <w:rPr>
+          <w:sz w:val="24"/>
+          <w:szCs w:val="24"/>
+          <w:lang w:val="en-US"/>
+        </w:rPr>
+        <w:t>Query A – How do I center a div?</w:t>
+      </w:r>
+    </w:p>
+    <w:p>
+      <w:pPr>
+        <w:pStyle w:val="ListParagraph"/>
+        <w:rPr>
+          <w:sz w:val="24"/>
+          <w:szCs w:val="24"/>
+          <w:lang w:val="en-US"/>
+        </w:rPr>
+      </w:pPr>
+      <w:r>
+        <w:rPr>
+          <w:sz w:val="24"/>
+          <w:szCs w:val="24"/>
+          <w:lang w:val="en-US"/>
+        </w:rPr>
+        <w:t>Query B – How can I align an HTML element in the middle of its parent</w:t>
+      </w:r>
+      <w:r>
+        <w:rPr>
+          <w:sz w:val="24"/>
+          <w:szCs w:val="24"/>
+          <w:lang w:val="en-US"/>
+        </w:rPr>
+        <w:t>?</w:t>
+      </w:r>
+    </w:p>
+    <w:p>
+      <w:pPr>
+        <w:pStyle w:val="ListParagraph"/>
+        <w:rPr>
+          <w:sz w:val="24"/>
+          <w:szCs w:val="24"/>
+          <w:lang w:val="en-US"/>
+        </w:rPr>
+      </w:pPr>
+    </w:p>
+    <w:p>
+      <w:pPr>
+        <w:pStyle w:val="ListParagraph"/>
+        <w:rPr>
+          <w:sz w:val="24"/>
+          <w:szCs w:val="24"/>
+          <w:lang w:val="en-US"/>
+        </w:rPr>
+      </w:pPr>
+      <w:r>
+        <w:rPr>
+          <w:sz w:val="24"/>
+          <w:szCs w:val="24"/>
+          <w:lang w:val="en-US"/>
+        </w:rPr>
+        <w:t>A keyword-based system may struggle if it relies only on exact word overlap.</w:t>
+      </w:r>
+    </w:p>
+    <w:p>
+      <w:pPr>
+        <w:pStyle w:val="ListParagraph"/>
+        <w:rPr>
+          <w:sz w:val="24"/>
+          <w:szCs w:val="24"/>
+          <w:lang w:val="en-US"/>
+        </w:rPr>
+      </w:pPr>
+      <w:r>
+        <w:rPr>
+          <w:sz w:val="24"/>
+          <w:szCs w:val="24"/>
+          <w:lang w:val="en-US"/>
+        </w:rPr>
+        <w:t>An embedding-based system can represent both queries as vectors and discover that they are close in meaning.</w:t>
+      </w:r>
+    </w:p>
+    <w:p>
+      <w:pPr>
+        <w:rPr>
+          <w:sz w:val="24"/>
+          <w:szCs w:val="24"/>
+          <w:lang w:val="en-US"/>
+        </w:rPr>
+      </w:pPr>
+    </w:p>
+    <w:p>
+      <w:pPr>
+        <w:pStyle w:val="ListParagraph"/>
+        <w:numPr>
+          <w:ilvl w:val="0"/>
+          <w:numId w:val="1"/>
+        </w:numPr>
+        <w:rPr>
+          <w:sz w:val="24"/>
+          <w:szCs w:val="24"/>
+          <w:lang w:val="en-US"/>
+        </w:rPr>
+      </w:pPr>
+      <w:r>
+        <w:rPr>
+          <w:sz w:val="24"/>
+          <w:szCs w:val="24"/>
+          <w:lang w:val="en-US"/>
+        </w:rPr>
+        <w:lastRenderedPageBreak/>
+        <w:t>Embeddings allow systems to compare broader meaning rather than only matching identical words.</w:t>
+      </w:r>
+    </w:p>
+    <w:p>
+      <w:pPr>
+        <w:rPr>
+          <w:sz w:val="24"/>
+          <w:szCs w:val="24"/>
+          <w:lang w:val="en-US"/>
+        </w:rPr>
+      </w:pPr>
+    </w:p>
+    <w:p>
+      <w:pPr>
+        <w:pStyle w:val="ListParagraph"/>
+        <w:numPr>
+          <w:ilvl w:val="0"/>
+          <w:numId w:val="1"/>
+        </w:numPr>
+        <w:rPr>
+          <w:sz w:val="24"/>
+          <w:szCs w:val="24"/>
+          <w:lang w:val="en-US"/>
+        </w:rPr>
+      </w:pPr>
+      <w:r>
+        <w:rPr>
+          <w:sz w:val="24"/>
+          <w:szCs w:val="24"/>
+          <w:lang w:val="en-US"/>
+        </w:rPr>
+        <w:t>Cosine similarity compares the angle between 2 vectors. It focuses more on direction than on absolute length.</w:t>
+      </w:r>
+      <w:r>
+        <w:rPr>
+          <w:sz w:val="24"/>
+          <w:szCs w:val="24"/>
+          <w:lang w:val="en-US"/>
+        </w:rPr>
+        <w:t xml:space="preserve"> If 2 vectors point in a similar direction, the represented concepts may be similar. If they point in unrelated directions, the concepts may be less similar.</w:t>
+      </w:r>
+      <w:r>
+        <w:rPr>
+          <w:sz w:val="24"/>
+          <w:szCs w:val="24"/>
+          <w:lang w:val="en-US"/>
+        </w:rPr>
+        <w:t xml:space="preserve"> </w:t>
       </w:r>
     </w:p>
     <w:sectPr>

</xml_diff>